<commit_message>
Actualizacion de formatos y mejoras en para la generacion de SCPM-07 y exportacion de plantilla para STPS basandose en si el trabajador estado dado de baja
</commit_message>
<xml_diff>
--- a/backend/outputs/50693527/50693527_224277_SCPM-04 COMBINADA.docx
+++ b/backend/outputs/50693527/50693527_224277_SCPM-04 COMBINADA.docx
@@ -6425,7 +6425,7 @@
                 <w:szCs w:val="18"/>
                 <w:lang w:val="es-ES"/>
               </w:rPr>
-              <w:t xml:space="preserve"/>
+              <w:t xml:space="preserve">Ejecutivo Zarate</w:t>
             </w:r>
             <w:r>
               <w:rPr>
@@ -6467,7 +6467,7 @@
                 <w:szCs w:val="18"/>
                 <w:lang w:val="es-ES"/>
               </w:rPr>
-              <w:t xml:space="preserve"> </w:t>
+              <w:t xml:space="preserve"> 327374</w:t>
             </w:r>
           </w:p>
         </w:tc>
@@ -7299,7 +7299,7 @@
           <w:szCs w:val="18"/>
           <w:lang w:val="pt-PT"/>
         </w:rPr>
-        <w:t xml:space="preserve"/>
+        <w:t xml:space="preserve">Ejecutivo Zarate</w:t>
       </w:r>
       <w:r>
         <w:rPr>
@@ -7329,7 +7329,7 @@
           <w:szCs w:val="18"/>
           <w:lang w:val="pt-PT"/>
         </w:rPr>
-        <w:t xml:space="preserve">- </w:t>
+        <w:t xml:space="preserve">- 327374</w:t>
       </w:r>
     </w:p>
     <w:p>

</xml_diff>